<commit_message>
Update of the Italian translation Fixed graphicspath.
First changes
</commit_message>
<xml_diff>
--- a/translations/it-IT/ScrumAtScaleGuide-Cover.docx
+++ b/translations/it-IT/ScrumAtScaleGuide-Cover.docx
@@ -2,8 +2,6 @@
 <file path=word/document.xml><?xml version="1.0" encoding="utf-8"?>
 <w:document xmlns:wpc="http://schemas.microsoft.com/office/word/2010/wordprocessingCanvas" xmlns:cx="http://schemas.microsoft.com/office/drawing/2014/chartex" xmlns:cx1="http://schemas.microsoft.com/office/drawing/2015/9/8/chartex" xmlns:cx2="http://schemas.microsoft.com/office/drawing/2015/10/21/chartex" xmlns:cx3="http://schemas.microsoft.com/office/drawing/2016/5/9/chartex" xmlns:cx4="http://schemas.microsoft.com/office/drawing/2016/5/10/chartex" xmlns:cx5="http://schemas.microsoft.com/office/drawing/2016/5/11/chartex" xmlns:cx6="http://schemas.microsoft.com/office/drawing/2016/5/12/chartex" xmlns:cx7="http://schemas.microsoft.com/office/drawing/2016/5/13/chartex" xmlns:cx8="http://schemas.microsoft.com/office/drawing/2016/5/14/chartex" xmlns:mc="http://schemas.openxmlformats.org/markup-compatibility/2006" xmlns:aink="http://schemas.microsoft.com/office/drawing/2016/ink" xmlns:am3d="http://schemas.microsoft.com/office/drawing/2017/model3d" xmlns:o="urn:schemas-microsoft-com:office:office" xmlns:r="http://schemas.openxmlformats.org/officeDocument/2006/relationships" xmlns:m="http://schemas.openxmlformats.org/officeDocument/2006/math" xmlns:v="urn:schemas-microsoft-com:vml" xmlns:wp14="http://schemas.microsoft.com/office/word/2010/wordprocessingDrawing" xmlns:wp="http://schemas.openxmlformats.org/drawingml/2006/wordprocessingDrawing" xmlns:w10="urn:schemas-microsoft-com:office:word" xmlns:w="http://schemas.openxmlformats.org/wordprocessingml/2006/main" xmlns:w14="http://schemas.microsoft.com/office/word/2010/wordml" xmlns:w15="http://schemas.microsoft.com/office/word/2012/wordml" xmlns:w16cid="http://schemas.microsoft.com/office/word/2016/wordml/cid" xmlns:w16se="http://schemas.microsoft.com/office/word/2015/wordml/symex" xmlns:wpg="http://schemas.microsoft.com/office/word/2010/wordprocessingGroup" xmlns:wpi="http://schemas.microsoft.com/office/word/2010/wordprocessingInk" xmlns:wne="http://schemas.microsoft.com/office/word/2006/wordml" xmlns:wps="http://schemas.microsoft.com/office/word/2010/wordprocessingShape" mc:Ignorable="w14 w15 w16se w16cid wp14">
   <w:body>
-    <w:bookmarkStart w:id="0" w:name="_GoBack"/>
-    <w:bookmarkEnd w:id="0"/>
     <w:p>
       <w:r>
         <w:rPr>
@@ -69,6 +67,7 @@
                                 <w:color w:val="666666"/>
                                 <w:sz w:val="44"/>
                                 <w:szCs w:val="76"/>
+                                <w:lang w:val="it-IT"/>
                               </w:rPr>
                             </w:pPr>
                             <w:r>
@@ -79,6 +78,7 @@
                                 <w:color w:val="666666"/>
                                 <w:sz w:val="44"/>
                                 <w:szCs w:val="76"/>
+                                <w:lang w:val="it-IT"/>
                               </w:rPr>
                               <w:t>La guida definitiva a</w:t>
                             </w:r>
@@ -90,6 +90,7 @@
                                 <w:color w:val="666666"/>
                                 <w:sz w:val="44"/>
                                 <w:szCs w:val="76"/>
+                                <w:lang w:val="it-IT"/>
                               </w:rPr>
                               <w:t xml:space="preserve"> Scrum@Scale:</w:t>
                             </w:r>
@@ -101,6 +102,7 @@
                                 <w:color w:val="666666"/>
                                 <w:sz w:val="44"/>
                                 <w:szCs w:val="76"/>
+                                <w:lang w:val="it-IT"/>
                               </w:rPr>
                               <w:br/>
                             </w:r>
@@ -112,6 +114,7 @@
                                 <w:color w:val="666666"/>
                                 <w:sz w:val="44"/>
                                 <w:szCs w:val="76"/>
+                                <w:lang w:val="it-IT"/>
                               </w:rPr>
                               <w:t xml:space="preserve">Lo </w:t>
                             </w:r>
@@ -123,6 +126,7 @@
                                 <w:color w:val="666666"/>
                                 <w:sz w:val="44"/>
                                 <w:szCs w:val="76"/>
+                                <w:lang w:val="it-IT"/>
                               </w:rPr>
                               <w:t xml:space="preserve">Scaling </w:t>
                             </w:r>
@@ -134,6 +138,7 @@
                                 <w:color w:val="666666"/>
                                 <w:sz w:val="44"/>
                                 <w:szCs w:val="76"/>
+                                <w:lang w:val="it-IT"/>
                               </w:rPr>
                               <w:t>che funziona</w:t>
                             </w:r>
@@ -177,6 +182,7 @@
                           <w:color w:val="666666"/>
                           <w:sz w:val="44"/>
                           <w:szCs w:val="76"/>
+                          <w:lang w:val="it-IT"/>
                         </w:rPr>
                       </w:pPr>
                       <w:r>
@@ -187,10 +193,10 @@
                           <w:color w:val="666666"/>
                           <w:sz w:val="44"/>
                           <w:szCs w:val="76"/>
-                        </w:rPr>
-                        <w:t xml:space="preserve">La </w:t>
-                      </w:r>
-                      <w:proofErr w:type="spellStart"/>
+                          <w:lang w:val="it-IT"/>
+                        </w:rPr>
+                        <w:t>La guida definitiva a</w:t>
+                      </w:r>
                       <w:r>
                         <w:rPr>
                           <w:rFonts w:ascii="Open Sans SemiBold" w:hAnsi="Open Sans SemiBold"/>
@@ -199,10 +205,10 @@
                           <w:color w:val="666666"/>
                           <w:sz w:val="44"/>
                           <w:szCs w:val="76"/>
-                        </w:rPr>
-                        <w:t>guida</w:t>
-                      </w:r>
-                      <w:proofErr w:type="spellEnd"/>
+                          <w:lang w:val="it-IT"/>
+                        </w:rPr>
+                        <w:t xml:space="preserve"> Scrum@Scale:</w:t>
+                      </w:r>
                       <w:r>
                         <w:rPr>
                           <w:rFonts w:ascii="Open Sans SemiBold" w:hAnsi="Open Sans SemiBold"/>
@@ -211,10 +217,10 @@
                           <w:color w:val="666666"/>
                           <w:sz w:val="44"/>
                           <w:szCs w:val="76"/>
-                        </w:rPr>
-                        <w:t xml:space="preserve"> </w:t>
-                      </w:r>
-                      <w:proofErr w:type="spellStart"/>
+                          <w:lang w:val="it-IT"/>
+                        </w:rPr>
+                        <w:br/>
+                      </w:r>
                       <w:r>
                         <w:rPr>
                           <w:rFonts w:ascii="Open Sans SemiBold" w:hAnsi="Open Sans SemiBold"/>
@@ -223,10 +229,10 @@
                           <w:color w:val="666666"/>
                           <w:sz w:val="44"/>
                           <w:szCs w:val="76"/>
-                        </w:rPr>
-                        <w:t>definitiva</w:t>
-                      </w:r>
-                      <w:proofErr w:type="spellEnd"/>
+                          <w:lang w:val="it-IT"/>
+                        </w:rPr>
+                        <w:t xml:space="preserve">Lo </w:t>
+                      </w:r>
                       <w:r>
                         <w:rPr>
                           <w:rFonts w:ascii="Open Sans SemiBold" w:hAnsi="Open Sans SemiBold"/>
@@ -235,8 +241,9 @@
                           <w:color w:val="666666"/>
                           <w:sz w:val="44"/>
                           <w:szCs w:val="76"/>
-                        </w:rPr>
-                        <w:t xml:space="preserve"> a</w:t>
+                          <w:lang w:val="it-IT"/>
+                        </w:rPr>
+                        <w:t xml:space="preserve">Scaling </w:t>
                       </w:r>
                       <w:r>
                         <w:rPr>
@@ -246,79 +253,10 @@
                           <w:color w:val="666666"/>
                           <w:sz w:val="44"/>
                           <w:szCs w:val="76"/>
-                        </w:rPr>
-                        <w:t xml:space="preserve"> Scrum@Scale:</w:t>
-                      </w:r>
-                      <w:r>
-                        <w:rPr>
-                          <w:rFonts w:ascii="Open Sans SemiBold" w:hAnsi="Open Sans SemiBold"/>
-                          <w:b/>
-                          <w:bCs/>
-                          <w:color w:val="666666"/>
-                          <w:sz w:val="44"/>
-                          <w:szCs w:val="76"/>
-                        </w:rPr>
-                        <w:br/>
-                      </w:r>
-                      <w:r>
-                        <w:rPr>
-                          <w:rFonts w:ascii="Open Sans SemiBold" w:hAnsi="Open Sans SemiBold"/>
-                          <w:b/>
-                          <w:bCs/>
-                          <w:color w:val="666666"/>
-                          <w:sz w:val="44"/>
-                          <w:szCs w:val="76"/>
-                        </w:rPr>
-                        <w:t xml:space="preserve">Lo </w:t>
-                      </w:r>
-                      <w:r>
-                        <w:rPr>
-                          <w:rFonts w:ascii="Open Sans SemiBold" w:hAnsi="Open Sans SemiBold"/>
-                          <w:b/>
-                          <w:bCs/>
-                          <w:color w:val="666666"/>
-                          <w:sz w:val="44"/>
-                          <w:szCs w:val="76"/>
-                        </w:rPr>
-                        <w:t xml:space="preserve">Scaling </w:t>
-                      </w:r>
-                      <w:proofErr w:type="spellStart"/>
-                      <w:r>
-                        <w:rPr>
-                          <w:rFonts w:ascii="Open Sans SemiBold" w:hAnsi="Open Sans SemiBold"/>
-                          <w:b/>
-                          <w:bCs/>
-                          <w:color w:val="666666"/>
-                          <w:sz w:val="44"/>
-                          <w:szCs w:val="76"/>
-                        </w:rPr>
-                        <w:t>che</w:t>
-                      </w:r>
-                      <w:proofErr w:type="spellEnd"/>
-                      <w:r>
-                        <w:rPr>
-                          <w:rFonts w:ascii="Open Sans SemiBold" w:hAnsi="Open Sans SemiBold"/>
-                          <w:b/>
-                          <w:bCs/>
-                          <w:color w:val="666666"/>
-                          <w:sz w:val="44"/>
-                          <w:szCs w:val="76"/>
-                        </w:rPr>
-                        <w:t xml:space="preserve"> </w:t>
-                      </w:r>
-                      <w:proofErr w:type="spellStart"/>
-                      <w:r>
-                        <w:rPr>
-                          <w:rFonts w:ascii="Open Sans SemiBold" w:hAnsi="Open Sans SemiBold"/>
-                          <w:b/>
-                          <w:bCs/>
-                          <w:color w:val="666666"/>
-                          <w:sz w:val="44"/>
-                          <w:szCs w:val="76"/>
-                        </w:rPr>
-                        <w:t>funziona</w:t>
-                      </w:r>
-                      <w:proofErr w:type="spellEnd"/>
+                          <w:lang w:val="it-IT"/>
+                        </w:rPr>
+                        <w:t>che funziona</w:t>
+                      </w:r>
                     </w:p>
                   </w:txbxContent>
                 </v:textbox>
@@ -443,11 +381,7 @@
           </mc:Choice>
           <mc:Fallback>
             <w:pict>
-              <v:shapetype w14:anchorId="4CAB4A44" id="_x0000_t202" coordsize="21600,21600" o:spt="202" path="m,l,21600r21600,l21600,xe">
-                <v:stroke joinstyle="miter"/>
-                <v:path gradientshapeok="t" o:connecttype="rect"/>
-              </v:shapetype>
-              <v:shape id="Text Box 4" o:spid="_x0000_s1027" type="#_x0000_t202" style="position:absolute;margin-left:-54.05pt;margin-top:-34.8pt;width:576.1pt;height:1in;z-index:251663360;visibility:visible;mso-wrap-style:square;mso-width-percent:0;mso-wrap-distance-left:9pt;mso-wrap-distance-top:0;mso-wrap-distance-right:9pt;mso-wrap-distance-bottom:0;mso-position-horizontal:absolute;mso-position-horizontal-relative:margin;mso-position-vertical:absolute;mso-position-vertical-relative:text;mso-width-percent:0;mso-width-relative:margin;v-text-anchor:middle" o:gfxdata="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" filled="f" stroked="f">
+              <v:shape w14:anchorId="4CAB4A44" id="Text Box 4" o:spid="_x0000_s1027" type="#_x0000_t202" style="position:absolute;margin-left:-54.05pt;margin-top:-34.8pt;width:576.1pt;height:1in;z-index:251663360;visibility:visible;mso-wrap-style:square;mso-width-percent:0;mso-wrap-distance-left:9pt;mso-wrap-distance-top:0;mso-wrap-distance-right:9pt;mso-wrap-distance-bottom:0;mso-position-horizontal:absolute;mso-position-horizontal-relative:margin;mso-position-vertical:absolute;mso-position-vertical-relative:text;mso-width-percent:0;mso-width-relative:margin;v-text-anchor:middle" o:gfxdata="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" filled="f" stroked="f">
                 <v:textbox>
                   <w:txbxContent>
                     <w:p>
@@ -461,7 +395,6 @@
                           <w:szCs w:val="76"/>
                         </w:rPr>
                       </w:pPr>
-                      <w:proofErr w:type="spellStart"/>
                       <w:r>
                         <w:rPr>
                           <w:rFonts w:ascii="Open Sans" w:hAnsi="Open Sans"/>
@@ -470,18 +403,7 @@
                           <w:sz w:val="76"/>
                           <w:szCs w:val="76"/>
                         </w:rPr>
-                        <w:t>Guida</w:t>
-                      </w:r>
-                      <w:proofErr w:type="spellEnd"/>
-                      <w:r>
-                        <w:rPr>
-                          <w:rFonts w:ascii="Open Sans" w:hAnsi="Open Sans"/>
-                          <w:b/>
-                          <w:color w:val="CC0000"/>
-                          <w:sz w:val="76"/>
-                          <w:szCs w:val="76"/>
-                        </w:rPr>
-                        <w:t xml:space="preserve"> a</w:t>
+                        <w:t>Guida a</w:t>
                       </w:r>
                       <w:r>
                         <w:rPr>
@@ -638,6 +560,7 @@
                               <w:rPr>
                                 <w:rFonts w:ascii="Open Sans" w:hAnsi="Open Sans"/>
                                 <w:sz w:val="22"/>
+                                <w:lang w:val="it-IT"/>
                               </w:rPr>
                               <w:t xml:space="preserve">©1993-2018 Jeff Sutherland and Scrum Inc., </w:t>
                             </w:r>
@@ -645,6 +568,7 @@
                               <w:rPr>
                                 <w:rFonts w:ascii="Open Sans" w:hAnsi="Open Sans"/>
                                 <w:sz w:val="22"/>
+                                <w:lang w:val="it-IT"/>
                               </w:rPr>
                               <w:t>Tutti I Diritti Riservati</w:t>
                             </w:r>
@@ -652,6 +576,7 @@
                               <w:rPr>
                                 <w:rFonts w:ascii="Open Sans" w:hAnsi="Open Sans"/>
                                 <w:sz w:val="22"/>
+                                <w:lang w:val="it-IT"/>
                               </w:rPr>
                               <w:t xml:space="preserve"> </w:t>
                             </w:r>
@@ -659,6 +584,7 @@
                               <w:rPr>
                                 <w:rFonts w:ascii="Open Sans" w:hAnsi="Open Sans"/>
                                 <w:sz w:val="22"/>
+                                <w:lang w:val="it-IT"/>
                               </w:rPr>
                               <w:br/>
                               <w:t xml:space="preserve">Scrum@Scale </w:t>
@@ -667,6 +593,7 @@
                               <w:rPr>
                                 <w:rFonts w:ascii="Open Sans" w:hAnsi="Open Sans"/>
                                 <w:sz w:val="22"/>
+                                <w:lang w:val="it-IT"/>
                               </w:rPr>
                               <w:t xml:space="preserve">è un marchio registrato di </w:t>
                             </w:r>
@@ -674,6 +601,7 @@
                               <w:rPr>
                                 <w:rFonts w:ascii="Open Sans" w:hAnsi="Open Sans"/>
                                 <w:sz w:val="22"/>
+                                <w:lang w:val="it-IT"/>
                               </w:rPr>
                               <w:t xml:space="preserve">Scrum Inc. </w:t>
                             </w:r>
@@ -681,6 +609,7 @@
                               <w:rPr>
                                 <w:rFonts w:ascii="Open Sans" w:hAnsi="Open Sans"/>
                                 <w:sz w:val="22"/>
+                                <w:lang w:val="it-IT"/>
                               </w:rPr>
                               <w:br/>
                             </w:r>
@@ -754,61 +683,31 @@
                         <w:rPr>
                           <w:rFonts w:ascii="Open Sans" w:hAnsi="Open Sans"/>
                           <w:sz w:val="22"/>
+                          <w:lang w:val="it-IT"/>
                         </w:rPr>
                         <w:t xml:space="preserve">©1993-2018 Jeff Sutherland and Scrum Inc., </w:t>
                       </w:r>
-                      <w:proofErr w:type="spellStart"/>
                       <w:r>
                         <w:rPr>
                           <w:rFonts w:ascii="Open Sans" w:hAnsi="Open Sans"/>
                           <w:sz w:val="22"/>
-                        </w:rPr>
-                        <w:t>Tutti</w:t>
-                      </w:r>
-                      <w:proofErr w:type="spellEnd"/>
+                          <w:lang w:val="it-IT"/>
+                        </w:rPr>
+                        <w:t>Tutti I Diritti Riservati</w:t>
+                      </w:r>
                       <w:r>
                         <w:rPr>
                           <w:rFonts w:ascii="Open Sans" w:hAnsi="Open Sans"/>
                           <w:sz w:val="22"/>
-                        </w:rPr>
-                        <w:t xml:space="preserve"> I </w:t>
-                      </w:r>
-                      <w:proofErr w:type="spellStart"/>
+                          <w:lang w:val="it-IT"/>
+                        </w:rPr>
+                        <w:t xml:space="preserve"> </w:t>
+                      </w:r>
                       <w:r>
                         <w:rPr>
                           <w:rFonts w:ascii="Open Sans" w:hAnsi="Open Sans"/>
                           <w:sz w:val="22"/>
-                        </w:rPr>
-                        <w:t>Diritti</w:t>
-                      </w:r>
-                      <w:proofErr w:type="spellEnd"/>
-                      <w:r>
-                        <w:rPr>
-                          <w:rFonts w:ascii="Open Sans" w:hAnsi="Open Sans"/>
-                          <w:sz w:val="22"/>
-                        </w:rPr>
-                        <w:t xml:space="preserve"> </w:t>
-                      </w:r>
-                      <w:proofErr w:type="spellStart"/>
-                      <w:r>
-                        <w:rPr>
-                          <w:rFonts w:ascii="Open Sans" w:hAnsi="Open Sans"/>
-                          <w:sz w:val="22"/>
-                        </w:rPr>
-                        <w:t>Riservati</w:t>
-                      </w:r>
-                      <w:proofErr w:type="spellEnd"/>
-                      <w:r>
-                        <w:rPr>
-                          <w:rFonts w:ascii="Open Sans" w:hAnsi="Open Sans"/>
-                          <w:sz w:val="22"/>
-                        </w:rPr>
-                        <w:t xml:space="preserve"> </w:t>
-                      </w:r>
-                      <w:r>
-                        <w:rPr>
-                          <w:rFonts w:ascii="Open Sans" w:hAnsi="Open Sans"/>
-                          <w:sz w:val="22"/>
+                          <w:lang w:val="it-IT"/>
                         </w:rPr>
                         <w:br/>
                         <w:t xml:space="preserve">Scrum@Scale </w:t>
@@ -817,172 +716,61 @@
                         <w:rPr>
                           <w:rFonts w:ascii="Open Sans" w:hAnsi="Open Sans"/>
                           <w:sz w:val="22"/>
-                        </w:rPr>
-                        <w:t xml:space="preserve">è un </w:t>
-                      </w:r>
-                      <w:proofErr w:type="spellStart"/>
+                          <w:lang w:val="it-IT"/>
+                        </w:rPr>
+                        <w:t xml:space="preserve">è un marchio registrato di </w:t>
+                      </w:r>
                       <w:r>
                         <w:rPr>
                           <w:rFonts w:ascii="Open Sans" w:hAnsi="Open Sans"/>
                           <w:sz w:val="22"/>
-                        </w:rPr>
-                        <w:t>marchio</w:t>
-                      </w:r>
-                      <w:proofErr w:type="spellEnd"/>
+                          <w:lang w:val="it-IT"/>
+                        </w:rPr>
+                        <w:t xml:space="preserve">Scrum Inc. </w:t>
+                      </w:r>
                       <w:r>
                         <w:rPr>
                           <w:rFonts w:ascii="Open Sans" w:hAnsi="Open Sans"/>
                           <w:sz w:val="22"/>
-                        </w:rPr>
-                        <w:t xml:space="preserve"> </w:t>
-                      </w:r>
-                      <w:proofErr w:type="spellStart"/>
+                          <w:lang w:val="it-IT"/>
+                        </w:rPr>
+                        <w:br/>
+                      </w:r>
                       <w:r>
                         <w:rPr>
                           <w:rFonts w:ascii="Open Sans" w:hAnsi="Open Sans"/>
                           <w:sz w:val="22"/>
                         </w:rPr>
-                        <w:t>registrato</w:t>
-                      </w:r>
-                      <w:proofErr w:type="spellEnd"/>
+                        <w:t xml:space="preserve">Rilasciata sotto </w:t>
+                      </w:r>
                       <w:r>
                         <w:rPr>
                           <w:rFonts w:ascii="Open Sans" w:hAnsi="Open Sans"/>
                           <w:sz w:val="22"/>
                         </w:rPr>
-                        <w:t xml:space="preserve"> di </w:t>
+                        <w:t>Creative Commons 4.0 Attribu</w:t>
                       </w:r>
                       <w:r>
                         <w:rPr>
                           <w:rFonts w:ascii="Open Sans" w:hAnsi="Open Sans"/>
                           <w:sz w:val="22"/>
                         </w:rPr>
-                        <w:t xml:space="preserve">Scrum Inc. </w:t>
+                        <w:t xml:space="preserve">zione </w:t>
                       </w:r>
                       <w:r>
                         <w:rPr>
                           <w:rFonts w:ascii="Open Sans" w:hAnsi="Open Sans"/>
                           <w:sz w:val="22"/>
                         </w:rPr>
-                        <w:br/>
-                      </w:r>
-                      <w:proofErr w:type="spellStart"/>
+                        <w:t>-</w:t>
+                      </w:r>
                       <w:r>
                         <w:rPr>
                           <w:rFonts w:ascii="Open Sans" w:hAnsi="Open Sans"/>
                           <w:sz w:val="22"/>
                         </w:rPr>
-                        <w:t>Rilasciata</w:t>
-                      </w:r>
-                      <w:proofErr w:type="spellEnd"/>
-                      <w:r>
-                        <w:rPr>
-                          <w:rFonts w:ascii="Open Sans" w:hAnsi="Open Sans"/>
-                          <w:sz w:val="22"/>
-                        </w:rPr>
-                        <w:t xml:space="preserve"> sotto </w:t>
-                      </w:r>
-                      <w:r>
-                        <w:rPr>
-                          <w:rFonts w:ascii="Open Sans" w:hAnsi="Open Sans"/>
-                          <w:sz w:val="22"/>
-                        </w:rPr>
-                        <w:t xml:space="preserve">Creative Commons 4.0 </w:t>
-                      </w:r>
-                      <w:proofErr w:type="spellStart"/>
-                      <w:r>
-                        <w:rPr>
-                          <w:rFonts w:ascii="Open Sans" w:hAnsi="Open Sans"/>
-                          <w:sz w:val="22"/>
-                        </w:rPr>
-                        <w:t>Attribu</w:t>
-                      </w:r>
-                      <w:r>
-                        <w:rPr>
-                          <w:rFonts w:ascii="Open Sans" w:hAnsi="Open Sans"/>
-                          <w:sz w:val="22"/>
-                        </w:rPr>
-                        <w:t>zione</w:t>
-                      </w:r>
-                      <w:proofErr w:type="spellEnd"/>
-                      <w:r>
-                        <w:rPr>
-                          <w:rFonts w:ascii="Open Sans" w:hAnsi="Open Sans"/>
-                          <w:sz w:val="22"/>
-                        </w:rPr>
-                        <w:t xml:space="preserve"> </w:t>
-                      </w:r>
-                      <w:r>
-                        <w:rPr>
-                          <w:rFonts w:ascii="Open Sans" w:hAnsi="Open Sans"/>
-                          <w:sz w:val="22"/>
-                        </w:rPr>
-                        <w:t>-</w:t>
-                      </w:r>
-                      <w:r>
-                        <w:rPr>
-                          <w:rFonts w:ascii="Open Sans" w:hAnsi="Open Sans"/>
-                          <w:sz w:val="22"/>
-                        </w:rPr>
-                        <w:t xml:space="preserve"> </w:t>
-                      </w:r>
-                      <w:proofErr w:type="spellStart"/>
-                      <w:r>
-                        <w:rPr>
-                          <w:rFonts w:ascii="Open Sans" w:hAnsi="Open Sans"/>
-                          <w:sz w:val="22"/>
-                        </w:rPr>
-                        <w:t>Condividi</w:t>
-                      </w:r>
-                      <w:proofErr w:type="spellEnd"/>
-                      <w:r>
-                        <w:rPr>
-                          <w:rFonts w:ascii="Open Sans" w:hAnsi="Open Sans"/>
-                          <w:sz w:val="22"/>
-                        </w:rPr>
-                        <w:t xml:space="preserve"> </w:t>
-                      </w:r>
-                      <w:proofErr w:type="spellStart"/>
-                      <w:r>
-                        <w:rPr>
-                          <w:rFonts w:ascii="Open Sans" w:hAnsi="Open Sans"/>
-                          <w:sz w:val="22"/>
-                        </w:rPr>
-                        <w:t>allo</w:t>
-                      </w:r>
-                      <w:proofErr w:type="spellEnd"/>
-                      <w:r>
-                        <w:rPr>
-                          <w:rFonts w:ascii="Open Sans" w:hAnsi="Open Sans"/>
-                          <w:sz w:val="22"/>
-                        </w:rPr>
-                        <w:t xml:space="preserve"> </w:t>
-                      </w:r>
-                      <w:proofErr w:type="spellStart"/>
-                      <w:r>
-                        <w:rPr>
-                          <w:rFonts w:ascii="Open Sans" w:hAnsi="Open Sans"/>
-                          <w:sz w:val="22"/>
-                        </w:rPr>
-                        <w:t>stesso</w:t>
-                      </w:r>
-                      <w:proofErr w:type="spellEnd"/>
-                      <w:r>
-                        <w:rPr>
-                          <w:rFonts w:ascii="Open Sans" w:hAnsi="Open Sans"/>
-                          <w:sz w:val="22"/>
-                        </w:rPr>
-                        <w:t xml:space="preserve"> </w:t>
-                      </w:r>
-                      <w:proofErr w:type="spellStart"/>
-                      <w:r>
-                        <w:rPr>
-                          <w:rFonts w:ascii="Open Sans" w:hAnsi="Open Sans"/>
-                          <w:sz w:val="22"/>
-                        </w:rPr>
-                        <w:t>modo</w:t>
-                      </w:r>
-                      <w:proofErr w:type="spellEnd"/>
+                        <w:t xml:space="preserve"> Condividi allo stesso modo</w:t>
+                      </w:r>
                     </w:p>
                   </w:txbxContent>
                 </v:textbox>
@@ -1074,8 +862,10 @@
                               <w:rPr>
                                 <w:rFonts w:ascii="Open Sans" w:hAnsi="Open Sans"/>
                               </w:rPr>
-                              <w:t>2</w:t>
-                            </w:r>
+                              <w:t>5</w:t>
+                            </w:r>
+                            <w:bookmarkStart w:id="0" w:name="_GoBack"/>
+                            <w:bookmarkEnd w:id="0"/>
                             <w:r>
                               <w:rPr>
                                 <w:rFonts w:ascii="Open Sans" w:hAnsi="Open Sans"/>
@@ -1111,11 +901,7 @@
           </mc:Choice>
           <mc:Fallback>
             <w:pict>
-              <v:shapetype w14:anchorId="2EAA3A1E" id="_x0000_t202" coordsize="21600,21600" o:spt="202" path="m,l,21600r21600,l21600,xe">
-                <v:stroke joinstyle="miter"/>
-                <v:path gradientshapeok="t" o:connecttype="rect"/>
-              </v:shapetype>
-              <v:shape id="Text Box 3" o:spid="_x0000_s1029" type="#_x0000_t202" style="position:absolute;margin-left:49.2pt;margin-top:440pt;width:396pt;height:1in;z-index:251661312;visibility:visible;mso-wrap-style:square;mso-wrap-distance-left:9pt;mso-wrap-distance-top:0;mso-wrap-distance-right:9pt;mso-wrap-distance-bottom:0;mso-position-horizontal:absolute;mso-position-horizontal-relative:text;mso-position-vertical:absolute;mso-position-vertical-relative:text;v-text-anchor:middle" o:gfxdata="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" filled="f" stroked="f">
+              <v:shape w14:anchorId="2EAA3A1E" id="Text Box 3" o:spid="_x0000_s1029" type="#_x0000_t202" style="position:absolute;margin-left:49.2pt;margin-top:440pt;width:396pt;height:1in;z-index:251661312;visibility:visible;mso-wrap-style:square;mso-wrap-distance-left:9pt;mso-wrap-distance-top:0;mso-wrap-distance-right:9pt;mso-wrap-distance-bottom:0;mso-position-horizontal:absolute;mso-position-horizontal-relative:text;mso-position-vertical:absolute;mso-position-vertical-relative:text;v-text-anchor:middle" o:gfxdata="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" filled="f" stroked="f">
                 <v:textbox>
                   <w:txbxContent>
                     <w:p>
@@ -1147,8 +933,10 @@
                         <w:rPr>
                           <w:rFonts w:ascii="Open Sans" w:hAnsi="Open Sans"/>
                         </w:rPr>
-                        <w:t>2</w:t>
-                      </w:r>
+                        <w:t>5</w:t>
+                      </w:r>
+                      <w:bookmarkStart w:id="1" w:name="_GoBack"/>
+                      <w:bookmarkEnd w:id="1"/>
                       <w:r>
                         <w:rPr>
                           <w:rFonts w:ascii="Open Sans" w:hAnsi="Open Sans"/>
@@ -1199,7 +987,7 @@
     </w:rPrDefault>
     <w:pPrDefault/>
   </w:docDefaults>
-  <w:latentStyles w:defLockedState="0" w:defUIPriority="99" w:defSemiHidden="0" w:defUnhideWhenUsed="0" w:defQFormat="0" w:count="375">
+  <w:latentStyles w:defLockedState="0" w:defUIPriority="99" w:defSemiHidden="0" w:defUnhideWhenUsed="0" w:defQFormat="0" w:count="376">
     <w:lsdException w:name="Normal" w:uiPriority="0" w:qFormat="1"/>
     <w:lsdException w:name="heading 1" w:uiPriority="9" w:qFormat="1"/>
     <w:lsdException w:name="heading 2" w:semiHidden="1" w:uiPriority="9" w:unhideWhenUsed="1" w:qFormat="1"/>
@@ -1305,7 +1093,6 @@
     <w:lsdException w:name="HTML Sample" w:semiHidden="1" w:unhideWhenUsed="1"/>
     <w:lsdException w:name="HTML Typewriter" w:semiHidden="1" w:unhideWhenUsed="1"/>
     <w:lsdException w:name="HTML Variable" w:semiHidden="1" w:unhideWhenUsed="1"/>
-    <w:lsdException w:name="Normal Table" w:semiHidden="1" w:unhideWhenUsed="1"/>
     <w:lsdException w:name="annotation subject" w:semiHidden="1" w:unhideWhenUsed="1"/>
     <w:lsdException w:name="No List" w:semiHidden="1" w:unhideWhenUsed="1"/>
     <w:lsdException w:name="Outline List 1" w:semiHidden="1" w:unhideWhenUsed="1"/>
@@ -1352,10 +1139,8 @@
     <w:lsdException w:name="Table Subtle 2" w:semiHidden="1" w:unhideWhenUsed="1"/>
     <w:lsdException w:name="Table Web 1" w:semiHidden="1" w:unhideWhenUsed="1"/>
     <w:lsdException w:name="Table Web 2" w:semiHidden="1" w:unhideWhenUsed="1"/>
-    <w:lsdException w:name="Table Web 3" w:semiHidden="1" w:unhideWhenUsed="1"/>
     <w:lsdException w:name="Balloon Text" w:semiHidden="1" w:unhideWhenUsed="1"/>
     <w:lsdException w:name="Table Grid" w:uiPriority="39"/>
-    <w:lsdException w:name="Table Theme" w:semiHidden="1" w:unhideWhenUsed="1"/>
     <w:lsdException w:name="Placeholder Text" w:semiHidden="1"/>
     <w:lsdException w:name="No Spacing" w:uiPriority="1" w:qFormat="1"/>
     <w:lsdException w:name="Light Shading" w:uiPriority="60"/>
@@ -1573,18 +1358,19 @@
     <w:lsdException w:name="List Table 7 Colorful Accent 6" w:uiPriority="52"/>
     <w:lsdException w:name="Mention" w:semiHidden="1" w:unhideWhenUsed="1"/>
     <w:lsdException w:name="Smart Hyperlink" w:semiHidden="1" w:unhideWhenUsed="1"/>
+    <w:lsdException w:name="Smart Link" w:semiHidden="1" w:unhideWhenUsed="1"/>
   </w:latentStyles>
-  <w:style w:type="paragraph" w:default="1" w:styleId="Normale">
+  <w:style w:type="paragraph" w:default="1" w:styleId="Normal">
     <w:name w:val="Normal"/>
     <w:qFormat/>
   </w:style>
-  <w:style w:type="character" w:default="1" w:styleId="Carpredefinitoparagrafo">
+  <w:style w:type="character" w:default="1" w:styleId="DefaultParagraphFont">
     <w:name w:val="Default Paragraph Font"/>
     <w:uiPriority w:val="1"/>
     <w:semiHidden/>
     <w:unhideWhenUsed/>
   </w:style>
-  <w:style w:type="table" w:default="1" w:styleId="Tabellanormale">
+  <w:style w:type="table" w:default="1" w:styleId="TableNormal">
     <w:name w:val="Normal Table"/>
     <w:uiPriority w:val="99"/>
     <w:semiHidden/>
@@ -1599,7 +1385,7 @@
       </w:tblCellMar>
     </w:tblPr>
   </w:style>
-  <w:style w:type="numbering" w:default="1" w:styleId="Nessunelenco">
+  <w:style w:type="numbering" w:default="1" w:styleId="NoList">
     <w:name w:val="No List"/>
     <w:uiPriority w:val="99"/>
     <w:semiHidden/>

</xml_diff>